<commit_message>
Record NRF and IITP as not funded, and make not_funded actually silent
Both 2026 applications were rejected. They stay in cv.yaml as a record of the
work but must not appear on any CV.

That exposed a bug: the README promised not_funded was "printed nowhere", but
three renderers disagreed. The English CV filtered on status != awarded, so
rejections landed under "Submitted / under review"; the Korean 이력서 and its
Word export printed every grant with a 미선정 column. Only the web CV was right.

Grant filtering now goes through cvdata.funded_grants / pending_grants /
grants() instead of four inline comparisons, and a test renders a synthetic
rejected grant through all five outputs — including unzipping the .docx XML —
to assert it appears in none of them. Verified it fails when the filter is
removed.

Co-Authored-By: Claude Opus 5 <noreply@anthropic.com>
</commit_message>
<xml_diff>
--- a/build/이력서_김선휘.docx
+++ b/build/이력서_김선휘.docx
@@ -2179,177 +2179,6 @@
                 <w:sz w:val="18"/>
               </w:rPr>
               <w:t>상태</w:t>
-            </w:r>
-          </w:p>
-        </w:tc>
-      </w:tr>
-      <w:tr>
-        <w:tc>
-          <w:tcPr>
-            <w:tcW w:type="dxa" w:w="1707"/>
-          </w:tcPr>
-          <w:p>
-            <w:r/>
-            <w:r>
-              <w:rPr>
-                <w:sz w:val="18"/>
-              </w:rPr>
-              <w:t>2026.04–2029.12</w:t>
-            </w:r>
-          </w:p>
-        </w:tc>
-        <w:tc>
-          <w:tcPr>
-            <w:tcW w:type="dxa" w:w="1707"/>
-          </w:tcPr>
-          <w:p>
-            <w:r/>
-            <w:r>
-              <w:rPr>
-                <w:sz w:val="18"/>
-              </w:rPr>
-              <w:t>뇌 인지과학과 생물학적 학습 원리에 기반한 인공지능 학습 기술 개발</w:t>
-            </w:r>
-          </w:p>
-        </w:tc>
-        <w:tc>
-          <w:tcPr>
-            <w:tcW w:type="dxa" w:w="1707"/>
-          </w:tcPr>
-          <w:p>
-            <w:r/>
-            <w:r>
-              <w:rPr>
-                <w:sz w:val="18"/>
-              </w:rPr>
-              <w:t>과학기술정보통신부 · 정보통신기획평가원(IITP)</w:t>
-            </w:r>
-          </w:p>
-        </w:tc>
-        <w:tc>
-          <w:tcPr>
-            <w:tcW w:type="dxa" w:w="1707"/>
-          </w:tcPr>
-          <w:p>
-            <w:r/>
-            <w:r>
-              <w:rPr>
-                <w:sz w:val="18"/>
-              </w:rPr>
-              <w:t>참여연구원 (참여율 50%)</w:t>
-            </w:r>
-          </w:p>
-        </w:tc>
-        <w:tc>
-          <w:tcPr>
-            <w:tcW w:type="dxa" w:w="1707"/>
-          </w:tcPr>
-          <w:p>
-            <w:r/>
-            <w:r>
-              <w:rPr>
-                <w:sz w:val="18"/>
-              </w:rPr>
-            </w:r>
-          </w:p>
-        </w:tc>
-        <w:tc>
-          <w:tcPr>
-            <w:tcW w:type="dxa" w:w="1707"/>
-          </w:tcPr>
-          <w:p>
-            <w:r/>
-            <w:r>
-              <w:rPr>
-                <w:sz w:val="18"/>
-              </w:rPr>
-              <w:t>심사중</w:t>
-            </w:r>
-          </w:p>
-        </w:tc>
-      </w:tr>
-      <w:tr>
-        <w:tc>
-          <w:tcPr>
-            <w:tcW w:type="dxa" w:w="1707"/>
-          </w:tcPr>
-          <w:p>
-            <w:r/>
-            <w:r>
-              <w:rPr>
-                <w:sz w:val="18"/>
-              </w:rPr>
-              <w:t>2026–2028 (3 years, proposed)</w:t>
-            </w:r>
-          </w:p>
-        </w:tc>
-        <w:tc>
-          <w:tcPr>
-            <w:tcW w:type="dxa" w:w="1707"/>
-          </w:tcPr>
-          <w:p>
-            <w:r/>
-            <w:r>
-              <w:rPr>
-                <w:sz w:val="18"/>
-              </w:rPr>
-              <w:t>AI 기반 다개체 설치류 사회행동의 정량화와 전뇌 신경활성 연계 분석</w:t>
-            </w:r>
-          </w:p>
-        </w:tc>
-        <w:tc>
-          <w:tcPr>
-            <w:tcW w:type="dxa" w:w="1707"/>
-          </w:tcPr>
-          <w:p>
-            <w:r/>
-            <w:r>
-              <w:rPr>
-                <w:sz w:val="18"/>
-              </w:rPr>
-              <w:t>과학기술정보통신부 · 한국연구재단(NRF)</w:t>
-            </w:r>
-          </w:p>
-        </w:tc>
-        <w:tc>
-          <w:tcPr>
-            <w:tcW w:type="dxa" w:w="1707"/>
-          </w:tcPr>
-          <w:p>
-            <w:r/>
-            <w:r>
-              <w:rPr>
-                <w:sz w:val="18"/>
-              </w:rPr>
-              <w:t>연구책임자</w:t>
-            </w:r>
-          </w:p>
-        </w:tc>
-        <w:tc>
-          <w:tcPr>
-            <w:tcW w:type="dxa" w:w="1707"/>
-          </w:tcPr>
-          <w:p>
-            <w:r/>
-            <w:r>
-              <w:rPr>
-                <w:sz w:val="18"/>
-              </w:rPr>
-              <w:t>up to ₩150M/year (requested)</w:t>
-            </w:r>
-          </w:p>
-        </w:tc>
-        <w:tc>
-          <w:tcPr>
-            <w:tcW w:type="dxa" w:w="1707"/>
-          </w:tcPr>
-          <w:p>
-            <w:r/>
-            <w:r>
-              <w:rPr>
-                <w:sz w:val="18"/>
-              </w:rPr>
-              <w:t>심사중</w:t>
             </w:r>
           </w:p>
         </w:tc>

</xml_diff>